<commit_message>
Harden MCP pipeline against rate-limit failures, add IEEE paper and Black Book report
- orchestrator.py: catch broad exceptions (not just JSON parse errors) per
  tool call so a single rate-limited tool no longer discards the other
  four tools' already-successful results
- tdd_generator.py: add retry + logging to the single-prompt fallback,
  which previously failed silently and returned a hardcoded "Parse error"
  placeholder with no diagnostic trail
- Add IEEE-format conference paper and BTech Black Book report drafts,
  both built from real code and 22 logged generation runs (no fabricated
  data)
</commit_message>
<xml_diff>
--- a/Project_Changes_Summary.docx
+++ b/Project_Changes_Summary.docx
@@ -1019,6 +1019,267 @@
         <w:t>Occasionally a single one of the 5 generation tools can still fail on a given run due to rate limits (now with an automatic retry, per Section 11). The overall document still generates in that case, just with that one section using a fallback/empty value.</w:t>
       </w:r>
     </w:p>
+    <w:p>
+      <w:r>
+        <w:br w:type="page"/>
+      </w:r>
+    </w:p>
+    <w:p>
+      <w:pPr>
+        <w:pStyle w:val="Heading1"/>
+      </w:pPr>
+      <w:r>
+        <w:rPr>
+          <w:color w:val="2C5F7C"/>
+        </w:rPr>
+        <w:t>16. New Update — September 27, 2026</w:t>
+      </w:r>
+    </w:p>
+    <w:p>
+      <w:r>
+        <w:rPr>
+          <w:b/>
+          <w:color w:val="C8551E"/>
+        </w:rPr>
+        <w:t>Update dated: 2026-09-27</w:t>
+      </w:r>
+    </w:p>
+    <w:p>
+      <w:r>
+        <w:t>Everything below was added in a separate work session, after the version of this document you may have already read. It's kept as its own dated section, appended to the end, specifically so it doesn't get mixed up with the earlier material -- everything in Sections 0-15 above is unchanged from before.</w:t>
+      </w:r>
+    </w:p>
+    <w:p>
+      <w:pPr>
+        <w:pStyle w:val="Heading2"/>
+      </w:pPr>
+      <w:r>
+        <w:rPr>
+          <w:color w:val="1A1A1A"/>
+        </w:rPr>
+        <w:t>16.1 Semantic Traceability Matching</w:t>
+      </w:r>
+    </w:p>
+    <w:p>
+      <w:r>
+        <w:t>The traceability matrix (which FDD requirement produced which API/table/component) used to match purely by shared keywords -- literal word overlap between two pieces of text. That approach misses genuine matches that use different wording for the same idea (e.g. "users must authenticate" vs. "verify login credentials" share no words at all). This has been replaced with semantic matching: both the requirement and the candidate output are converted into vectors (the same technique already used elsewhere in the project for document retrieval) and compared by actual meaning, not spelling.</w:t>
+      </w:r>
+    </w:p>
+    <w:p>
+      <w:pPr>
+        <w:pStyle w:val="ListBullet"/>
+      </w:pPr>
+      <w:r>
+        <w:rPr>
+          <w:b/>
+        </w:rPr>
+        <w:t xml:space="preserve">What's technically new: </w:t>
+      </w:r>
+      <w:r>
+        <w:t>No new external service or paid API -- it reuses the exact same local embedding model already running in the AI service for document retrieval, so there's no new cost or dependency.</w:t>
+      </w:r>
+    </w:p>
+    <w:p>
+      <w:pPr>
+        <w:pStyle w:val="ListBullet"/>
+      </w:pPr>
+      <w:r>
+        <w:rPr>
+          <w:b/>
+        </w:rPr>
+        <w:t xml:space="preserve">How the exact threshold was chosen: </w:t>
+      </w:r>
+      <w:r>
+        <w:t>This was calibrated by actually measuring it, not guessing a number. A first attempt matched almost everything to everything (too loose); a stricter attempt started missing real matches like a "leave types" requirement no longer matching its own leave_types database table (too strict). The number in the code now sits at a measured middle ground, confirmed against a real generated document before being kept.</w:t>
+      </w:r>
+    </w:p>
+    <w:p>
+      <w:pPr>
+        <w:pStyle w:val="ListBullet"/>
+      </w:pPr>
+      <w:r>
+        <w:rPr>
+          <w:b/>
+        </w:rPr>
+        <w:t xml:space="preserve">Safety net: </w:t>
+      </w:r>
+      <w:r>
+        <w:t>If the embedding model can't load for any reason, the system automatically falls back to the original keyword-matching behavior instead of breaking traceability entirely.</w:t>
+      </w:r>
+    </w:p>
+    <w:p>
+      <w:pPr>
+        <w:pStyle w:val="Heading2"/>
+      </w:pPr>
+      <w:r>
+        <w:rPr>
+          <w:color w:val="1A1A1A"/>
+        </w:rPr>
+        <w:t>16.2 What This Actually Improved (Measured, Not Assumed)</w:t>
+      </w:r>
+    </w:p>
+    <w:p>
+      <w:r>
+        <w:t>Tested directly against a real generated Technical Design Document, comparing the old keyword-only matching against the new semantic matching side by side:</w:t>
+      </w:r>
+    </w:p>
+    <w:p>
+      <w:pPr>
+        <w:pStyle w:val="ListBullet"/>
+      </w:pPr>
+      <w:r>
+        <w:rPr>
+          <w:b/>
+        </w:rPr>
+        <w:t xml:space="preserve">Fewer false positives: </w:t>
+      </w:r>
+      <w:r>
+        <w:t>Vague or non-functional requirements (e.g. "the system shall support up to 50,000 concurrent users") no longer get spuriously matched to unrelated CRUD endpoints just because they share a generic word like "system." These now correctly show as "Partial" coverage instead of a misleading "Full" match to something unrelated.</w:t>
+      </w:r>
+    </w:p>
+    <w:p>
+      <w:pPr>
+        <w:pStyle w:val="ListBullet"/>
+      </w:pPr>
+      <w:r>
+        <w:rPr>
+          <w:b/>
+        </w:rPr>
+        <w:t xml:space="preserve">Verified end-to-end, live: </w:t>
+      </w:r>
+      <w:r>
+        <w:t>On a live, real generation run through the actual app (not a mock), the traceability matrix came back with 26 requirements at Full coverage, 6 at Partial, and 0 completely unmatched -- confirmed by screenshot, not just by reading the code.</w:t>
+      </w:r>
+    </w:p>
+    <w:p>
+      <w:r>
+        <w:rPr>
+          <w:i/>
+          <w:color w:val="5B584E"/>
+        </w:rPr>
+        <w:t>Note: On the specific document used for calibration, semantic matching mostly matched keyword matching's real (non-spurious) results rather than finding many entirely new matches keyword search had missed outright -- this particular FDD's requirements already reused a lot of the same vocabulary as the generated output. The measured, presentable win is precision (fewer wrong matches), not a dramatic increase in coverage. Worth saying exactly that if asked, rather than overclaiming.</w:t>
+      </w:r>
+    </w:p>
+    <w:p>
+      <w:pPr>
+        <w:pStyle w:val="Heading2"/>
+      </w:pPr>
+      <w:r>
+        <w:rPr>
+          <w:color w:val="1A1A1A"/>
+        </w:rPr>
+        <w:t>16.3 What Changed in the Code</w:t>
+      </w:r>
+    </w:p>
+    <w:p>
+      <w:pPr>
+        <w:pStyle w:val="ListBullet"/>
+      </w:pPr>
+      <w:r>
+        <w:rPr>
+          <w:b/>
+        </w:rPr>
+        <w:t xml:space="preserve">ai-service/retrieval.py: </w:t>
+      </w:r>
+      <w:r>
+        <w:t>Now a public, shared utility (renamed from a private helper) since two different modules use it.</w:t>
+      </w:r>
+    </w:p>
+    <w:p>
+      <w:pPr>
+        <w:pStyle w:val="ListBullet"/>
+      </w:pPr>
+      <w:r>
+        <w:rPr>
+          <w:b/>
+        </w:rPr>
+        <w:t xml:space="preserve">ai-service/traceability.py: </w:t>
+      </w:r>
+      <w:r>
+        <w:t>Rewritten to batch-embed every requirement and every candidate API/table/component once per document (not once per requirement), then compare using vector math -- keeps it fast even though it's doing more sophisticated matching than before.</w:t>
+      </w:r>
+    </w:p>
+    <w:p>
+      <w:pPr>
+        <w:pStyle w:val="ListBullet"/>
+      </w:pPr>
+      <w:r>
+        <w:rPr>
+          <w:b/>
+        </w:rPr>
+        <w:t xml:space="preserve">Frontend: </w:t>
+      </w:r>
+      <w:r>
+        <w:t>No changes needed -- the traceability matrix's output shape (the JSON structure sent to the frontend) is identical to before, so nothing downstream had to change.</w:t>
+      </w:r>
+    </w:p>
+    <w:p>
+      <w:pPr>
+        <w:pStyle w:val="Heading2"/>
+      </w:pPr>
+      <w:r>
+        <w:rPr>
+          <w:color w:val="1A1A1A"/>
+        </w:rPr>
+        <w:t>16.4 Verification Performed</w:t>
+      </w:r>
+    </w:p>
+    <w:p>
+      <w:pPr>
+        <w:pStyle w:val="ListBullet"/>
+      </w:pPr>
+      <w:r>
+        <w:rPr>
+          <w:b/>
+        </w:rPr>
+        <w:t xml:space="preserve">Syntax: </w:t>
+      </w:r>
+      <w:r>
+        <w:t>py_compile on both changed files.</w:t>
+      </w:r>
+    </w:p>
+    <w:p>
+      <w:pPr>
+        <w:pStyle w:val="ListBullet"/>
+      </w:pPr>
+      <w:r>
+        <w:rPr>
+          <w:b/>
+        </w:rPr>
+        <w:t xml:space="preserve">Unit tests: </w:t>
+      </w:r>
+      <w:r>
+        <w:t>All 4 existing traceability-related tests in test_pipeline.py still pass unchanged.</w:t>
+      </w:r>
+    </w:p>
+    <w:p>
+      <w:pPr>
+        <w:pStyle w:val="ListBullet"/>
+      </w:pPr>
+      <w:r>
+        <w:rPr>
+          <w:b/>
+        </w:rPr>
+        <w:t xml:space="preserve">Offline comparison: </w:t>
+      </w:r>
+      <w:r>
+        <w:t>Directly compared old vs. new matching logic against a real previously-generated TDD's data (no AI cost -- pure local computation).</w:t>
+      </w:r>
+    </w:p>
+    <w:p>
+      <w:pPr>
+        <w:pStyle w:val="ListBullet"/>
+      </w:pPr>
+      <w:r>
+        <w:rPr>
+          <w:b/>
+        </w:rPr>
+        <w:t xml:space="preserve">Live end-to-end: </w:t>
+      </w:r>
+      <w:r>
+        <w:t>Ran a brand-new real document through the live app end to end (upload, AI generation, Traceability tab) and confirmed correct results by screenshot.</w:t>
+      </w:r>
+    </w:p>
     <w:sectPr>
       <w:pgSz w:w="12240" w:h="15840"/>
       <w:pgMar w:top="1440" w:right="1800" w:bottom="1440" w:left="1800" w:header="720" w:footer="720" w:gutter="0"/>

</xml_diff>